<commit_message>
Video script: Zach intro only, Ido delivers rest solo, detailed screen directions Add high-bias and fair demo datasets with 3-button selector in Streamlit
- Video: Zach says intro only, Ido presents everything else
- Every section has [SCREEN] directions for what to show on the website
- New: csun_high_bias.csv (severe biases, everything fails)
- New: csun_fair.csv (no biases, everything passes)
- Streamlit: 3 demo data buttons (Standard, High Bias, Fair)
- Regenerated video_script.docx
</commit_message>
<xml_diff>
--- a/docs/video_script.docx
+++ b/docs/video_script.docx
@@ -65,10 +65,10 @@
           <w:b/>
           <w:color w:val="CF0A2C"/>
         </w:rPr>
-        <w:t xml:space="preserve">IDO: </w:t>
+        <w:t xml:space="preserve">ZACH: </w:t>
       </w:r>
       <w:r>
-        <w:t>"Hi, I am Ido Cohen, a Computer Science student here at CSUN."</w:t>
+        <w:t>"Hello, I am Zach Bar and I am a Junior at CSUN majoring in Computer Science."</w:t>
       </w:r>
     </w:p>
     <w:p>
@@ -77,10 +77,20 @@
           <w:b/>
           <w:color w:val="CF0A2C"/>
         </w:rPr>
-        <w:t xml:space="preserve">ZACH: </w:t>
+        <w:t xml:space="preserve">IDO: </w:t>
       </w:r>
       <w:r>
-        <w:t>"And I am Zach Bar, also studying Computer Science at CSUN. Together, we built MatadorAudit."</w:t>
+        <w:t>"Hello, I am Ido Cohen and I am a Senior at CSUN majoring in Computer Science. Together, we built MatadorAudit."</w:t>
+      </w:r>
+    </w:p>
+    <w:p>
+      <w:r>
+        <w:rPr>
+          <w:i/>
+          <w:color w:val="666666"/>
+          <w:sz w:val="20"/>
+        </w:rPr>
+        <w:t>[SCREEN: Navigate to matadoraudit.netlify.app landing page, scroll to show the hero section and track badge]</w:t>
       </w:r>
     </w:p>
     <w:p>
@@ -111,7 +121,7 @@
           <w:b/>
           <w:color w:val="CF0A2C"/>
         </w:rPr>
-        <w:t xml:space="preserve">ZACH: </w:t>
+        <w:t xml:space="preserve">IDO: </w:t>
       </w:r>
       <w:r>
         <w:t>"Right now, AI tools are making decisions about financial aid, admissions, course recommendations, plagiarism detection, scholarship allocation, academic advising, and more. These systems affect who gets funded, who gets admitted, and who gets flagged. But nobody is systematically checking whether those decisions are equitable across demographics."</w:t>
@@ -172,7 +182,7 @@
           <w:color w:val="666666"/>
           <w:sz w:val="20"/>
         </w:rPr>
-        <w:t>[SCREEN: MatadorAudit Netlify landing page at matadoraudit.netlify.app]</w:t>
+        <w:t>[SCREEN: Open matadoraudit.netlify.app, scroll through the feature cards on the landing page]</w:t>
       </w:r>
     </w:p>
     <w:p>
@@ -181,7 +191,7 @@
           <w:b/>
           <w:color w:val="CF0A2C"/>
         </w:rPr>
-        <w:t xml:space="preserve">ZACH: </w:t>
+        <w:t xml:space="preserve">IDO: </w:t>
       </w:r>
       <w:r>
         <w:t>"MatadorAudit is an AI-powered fairness auditing toolkit designed for non-technical university administrators. A financial aid director or department chair can upload a dataset and get a complete fairness audit without writing a single line of code. Our landing page lives at matadoraudit.netlify.app, and the live interactive tool runs at matadoraudit.streamlit.app."</w:t>
@@ -194,7 +204,7 @@
           <w:color w:val="666666"/>
           <w:sz w:val="20"/>
         </w:rPr>
-        <w:t>[SCREEN: Scroll through feature cards on the Netlify site, then open Streamlit app]</w:t>
+        <w:t>[SCREEN: Click the "Launch Tool" button to open matadoraudit.streamlit.app in a new tab]</w:t>
       </w:r>
     </w:p>
     <w:p>
@@ -216,7 +226,7 @@
           <w:color w:val="666666"/>
           <w:sz w:val="20"/>
         </w:rPr>
-        <w:t>[SCREEN: Navigate to the Methodology section, expand the Disparate Impact accordion]</w:t>
+        <w:t>[SCREEN: Navigate to the Methodology section on the Netlify site, expand the Disparate Impact accordion]</w:t>
       </w:r>
     </w:p>
     <w:p>
@@ -225,7 +235,7 @@
           <w:b/>
           <w:color w:val="CF0A2C"/>
         </w:rPr>
-        <w:t xml:space="preserve">ZACH: </w:t>
+        <w:t xml:space="preserve">IDO: </w:t>
       </w:r>
       <w:r>
         <w:t>"A key feature is Proxy Discrimination Detection. Many AI systems do not use race directly, but they use zip code, high school ranking, or a predicted persistence score that correlates strongly with race. Our tool uses point-biserial correlation to flag these hidden proxies. In our synthetic CSUN data, the predicted persistence variable correlates 0.25 with race -- meaning the model effectively knows a student's ethnicity through a supposedly neutral variable."</w:t>
@@ -238,7 +248,7 @@
           <w:color w:val="666666"/>
           <w:sz w:val="20"/>
         </w:rPr>
-        <w:t>[SCREEN: Show the proxy detection tab in the dashboard with correlation bars]</w:t>
+        <w:t>[SCREEN: Switch to the Streamlit app, navigate to the Proxy Detection tab, show the correlation bar chart]</w:t>
       </w:r>
     </w:p>
     <w:p>
@@ -260,7 +270,7 @@
           <w:color w:val="666666"/>
           <w:sz w:val="20"/>
         </w:rPr>
-        <w:t>[SCREEN: Show the AI Q&amp;A chat panel with a sample question and response]</w:t>
+        <w:t>[SCREEN: Navigate to the AI Q&amp;A Assistant page, show Groq selected, type a sample question and display the response]</w:t>
       </w:r>
     </w:p>
     <w:p>
@@ -269,7 +279,7 @@
           <w:b/>
           <w:color w:val="CF0A2C"/>
         </w:rPr>
-        <w:t xml:space="preserve">ZACH: </w:t>
+        <w:t xml:space="preserve">IDO: </w:t>
       </w:r>
       <w:r>
         <w:t>"What makes this responsible is what it does not do. MatadorAudit does not make decisions. It does not automatically debias anything. It provides transparency and lets humans decide what trade-offs are acceptable. We also never send raw student data to any external API -- AI models receive only statistical summaries."</w:t>
@@ -298,7 +308,7 @@
           <w:color w:val="666666"/>
           <w:sz w:val="20"/>
         </w:rPr>
-        <w:t>[SCREEN: Open the live Streamlit app at matadoraudit.streamlit.app]</w:t>
+        <w:t>[SCREEN: Navigate to the Upload &amp; Analyze page on matadoraudit.streamlit.app]</w:t>
       </w:r>
     </w:p>
     <w:p>
@@ -307,7 +317,7 @@
           <w:b/>
           <w:color w:val="CF0A2C"/>
         </w:rPr>
-        <w:t xml:space="preserve">ZACH: </w:t>
+        <w:t xml:space="preserve">IDO: </w:t>
       </w:r>
       <w:r>
         <w:t>"Let me walk you through the actual tool. Here is our live Streamlit dashboard."</w:t>
@@ -328,7 +338,7 @@
           <w:color w:val="666666"/>
           <w:sz w:val="20"/>
         </w:rPr>
-        <w:t>[SCREEN: Click "Load CSUN Demo Data" button. Dataset loads with 5,000 records.]</w:t>
+        <w:t>[SCREEN: Click "CSUN Standard Demo" button. Dataset loads with 5,000 records. Show the dataset overview cards appear.]</w:t>
       </w:r>
     </w:p>
     <w:p>
@@ -337,10 +347,10 @@
           <w:b/>
           <w:color w:val="CF0A2C"/>
         </w:rPr>
-        <w:t xml:space="preserve">ZACH: </w:t>
+        <w:t xml:space="preserve">IDO: </w:t>
       </w:r>
       <w:r>
-        <w:t>"An administrator clicks Load CSUN Demo Data -- or uploads their own CSV. The tool instantly detects 7 demographic columns and 8 outcome columns."</w:t>
+        <w:t>"An administrator clicks Load Demo Data -- or uploads their own CSV. The tool instantly detects 7 demographic columns and 8 outcome columns."</w:t>
       </w:r>
     </w:p>
     <w:p>
@@ -358,7 +368,7 @@
           <w:color w:val="666666"/>
           <w:sz w:val="20"/>
         </w:rPr>
-        <w:t>[SCREEN: Select race_ethnicity as demographic, financial_aid_approved as outcome, click Run Fairness Analysis. Metrics populate.]</w:t>
+        <w:t>[SCREEN: Select race_ethnicity as demographic, financial_aid_approved as outcome, click Run Fairness Analysis. Metrics populate with color-coded risk levels.]</w:t>
       </w:r>
     </w:p>
     <w:p>
@@ -398,7 +408,7 @@
           <w:color w:val="666666"/>
           <w:sz w:val="20"/>
         </w:rPr>
-        <w:t>[SCREEN: Navigate to the Multi-Audit Dashboard, click "Run All 8 Audits"]</w:t>
+        <w:t>[SCREEN: Click "Multi-Audit Dashboard" in the sidebar, then click "Run All 8 Audits"]</w:t>
       </w:r>
     </w:p>
     <w:p>
@@ -407,7 +417,7 @@
           <w:b/>
           <w:color w:val="CF0A2C"/>
         </w:rPr>
-        <w:t xml:space="preserve">ZACH: </w:t>
+        <w:t xml:space="preserve">IDO: </w:t>
       </w:r>
       <w:r>
         <w:t>"Our Multi-Audit Dashboard lets administrators run all eight audit scenarios at once. You can view results three ways: Summary Cards for a quick overview, Detailed Charts for deep analysis, or Comparison Table to see all metrics side by side. This is the fastest way to spot where bias lives across your institution."</w:t>
@@ -438,7 +448,7 @@
           <w:color w:val="666666"/>
           <w:sz w:val="20"/>
         </w:rPr>
-        <w:t>[SCREEN: Navigate to What-If Simulator, drag the threshold slider from 0.55 down to 0.40. Show metrics updating.]</w:t>
+        <w:t>[SCREEN: Click "What-If Simulator" in the sidebar, drag the threshold slider from 0.55 down to 0.40. Show metrics updating in real time.]</w:t>
       </w:r>
     </w:p>
     <w:p>
@@ -468,7 +478,7 @@
           <w:color w:val="666666"/>
           <w:sz w:val="20"/>
         </w:rPr>
-        <w:t>[SCREEN: Show AI Q&amp;A Assistant with Groq selected, ask a follow-up question]</w:t>
+        <w:t>[SCREEN: Navigate to the AI Q&amp;A Assistant page, select Groq as the provider, type "Why is the gap so large for Hispanic students?" and show the response]</w:t>
       </w:r>
     </w:p>
     <w:p>
@@ -477,7 +487,7 @@
           <w:b/>
           <w:color w:val="CF0A2C"/>
         </w:rPr>
-        <w:t xml:space="preserve">ZACH: </w:t>
+        <w:t xml:space="preserve">IDO: </w:t>
       </w:r>
       <w:r>
         <w:t>"After any audit, the AI Q&amp;A Assistant provides instant answers. And every page includes detailed next steps -- who to contact, what actions to take, and recommended timelines. This turns data into action."</w:t>
@@ -490,7 +500,7 @@
           <w:color w:val="666666"/>
           <w:sz w:val="20"/>
         </w:rPr>
-        <w:t>[SCREEN: Show the Next Steps section with contact recommendations and timeline]</w:t>
+        <w:t>[SCREEN: Scroll down to the Next Steps section showing contact recommendations and timeline]</w:t>
       </w:r>
     </w:p>
     <w:p>
@@ -516,7 +526,7 @@
           <w:color w:val="666666"/>
           <w:sz w:val="20"/>
         </w:rPr>
-        <w:t>[SCREEN: Show the Netlify site About section with the implementation timeline]</w:t>
+        <w:t>[SCREEN: Navigate to the About section on matadoraudit.netlify.app, scroll to the implementation timeline]</w:t>
       </w:r>
     </w:p>
     <w:p>
@@ -538,7 +548,7 @@
           <w:color w:val="666666"/>
           <w:sz w:val="20"/>
         </w:rPr>
-        <w:t>[SCREEN: Show the feasibility section -- tech stack table and cost breakdown]</w:t>
+        <w:t>[SCREEN: Scroll to the feasibility section showing the tech stack table and cost breakdown]</w:t>
       </w:r>
     </w:p>
     <w:p>
@@ -547,7 +557,7 @@
           <w:b/>
           <w:color w:val="CF0A2C"/>
         </w:rPr>
-        <w:t xml:space="preserve">ZACH: </w:t>
+        <w:t xml:space="preserve">IDO: </w:t>
       </w:r>
       <w:r>
         <w:t>"For integration with existing CSUN systems, administrators would export data from Canvas LMS or PeopleSoft as CSV files and upload them directly. No IT infrastructure changes needed. In a future phase, we envision direct API connectors to these systems for automated scheduled audits."</w:t>
@@ -560,7 +570,7 @@
           <w:color w:val="666666"/>
           <w:sz w:val="20"/>
         </w:rPr>
-        <w:t>[SCREEN: Simple flow diagram -- "Canvas/PeopleSoft Export -&gt; CSV Upload -&gt; MatadorAudit Analysis -&gt; Fairness Report -&gt; Admin Action"]</w:t>
+        <w:t>[SCREEN: Show flow diagram on the site -- "Canvas/PeopleSoft Export -&gt; CSV Upload -&gt; MatadorAudit Analysis -&gt; Fairness Report -&gt; Admin Action"]</w:t>
       </w:r>
     </w:p>
     <w:p>
@@ -582,7 +592,7 @@
           <w:color w:val="666666"/>
           <w:sz w:val="20"/>
         </w:rPr>
-        <w:t>[SCREEN: Map of CSU system with "23 campuses. 460,000+ students. One auditing standard."]</w:t>
+        <w:t>[SCREEN: Show the CSU system map with "23 campuses. 460,000+ students. One auditing standard."]</w:t>
       </w:r>
     </w:p>
     <w:p>
@@ -591,10 +601,20 @@
           <w:b/>
           <w:color w:val="CF0A2C"/>
         </w:rPr>
-        <w:t xml:space="preserve">ZACH: </w:t>
+        <w:t xml:space="preserve">IDO: </w:t>
       </w:r>
       <w:r>
         <w:t>"The challenges we anticipate are institutional resistance from departments whose tools show bias, and the mathematical reality that fairness metrics can conflict with each other -- you cannot satisfy all definitions simultaneously. We address this by framing audits as improvement opportunities, not blame, and by presenting multiple metrics so humans choose the right trade-offs."</w:t>
+      </w:r>
+    </w:p>
+    <w:p>
+      <w:r>
+        <w:rPr>
+          <w:i/>
+          <w:color w:val="666666"/>
+          <w:sz w:val="20"/>
+        </w:rPr>
+        <w:t>[SCREEN: Navigate to the Methodology section showing multiple fairness metric definitions side by side]</w:t>
       </w:r>
     </w:p>
     <w:p>
@@ -654,7 +674,7 @@
           <w:color w:val="666666"/>
           <w:sz w:val="20"/>
         </w:rPr>
-        <w:t>[SCREEN: Data Sources section from the Netlify site]</w:t>
+        <w:t>[SCREEN: Navigate to the Data Sources section on matadoraudit.netlify.app]</w:t>
       </w:r>
     </w:p>
     <w:p>
@@ -663,7 +683,7 @@
           <w:b/>
           <w:color w:val="CF0A2C"/>
         </w:rPr>
-        <w:t xml:space="preserve">ZACH: </w:t>
+        <w:t xml:space="preserve">IDO: </w:t>
       </w:r>
       <w:r>
         <w:t>"We used AI to assist with generating natural-language fairness reports, powering the Q&amp;A assistant, and helping structure our analysis framework. The fairness metrics themselves are computed using our own implementation based on established research by Dwork 2012, the EEOC 1978, Hardt 2016, Datta 2015, and Chouldechova 2017."</w:t>
@@ -688,19 +708,7 @@
         <w:t xml:space="preserve">IDO: </w:t>
       </w:r>
       <w:r>
-        <w:t>"Fair AI is not optional. It is an obligation."</w:t>
-      </w:r>
-    </w:p>
-    <w:p>
-      <w:r>
-        <w:rPr>
-          <w:b/>
-          <w:color w:val="CF0A2C"/>
-        </w:rPr>
-        <w:t xml:space="preserve">ZACH: </w:t>
-      </w:r>
-      <w:r>
-        <w:t>"MatadorAudit. Because every Matador deserves a fair shot."</w:t>
+        <w:t>"Fair AI is not optional. It is an obligation. MatadorAudit. Because every Matador deserves a fair shot."</w:t>
       </w:r>
     </w:p>
     <w:p>

</xml_diff>

<commit_message>
Replace all Groq references with OpenRouter in video script and docs
</commit_message>
<xml_diff>
--- a/docs/video_script.docx
+++ b/docs/video_script.docx
@@ -260,7 +260,7 @@
         <w:t xml:space="preserve">IDO: </w:t>
       </w:r>
       <w:r>
-        <w:t>"We also built an AI Q&amp;A Assistant directly into the tool. After running any audit, users can ask follow-up questions in plain English -- like 'Why is the gap so large for Hispanic students?' or 'What should I do next?' The assistant is powered by Groq, which is completely free with no setup required. Users can also connect Claude, ChatGPT, Gemini, or Ollama if they prefer."</w:t>
+        <w:t>"We also built an AI Q&amp;A Assistant directly into the tool. After running any audit, users can ask follow-up questions in plain English -- like 'Why is the gap so large for Hispanic students?' or 'What should I do next?' The assistant is powered by OpenRouter, which is completely free with no setup required. Users can also connect Claude, ChatGPT, Gemini, or Ollama if they prefer."</w:t>
       </w:r>
     </w:p>
     <w:p>
@@ -270,7 +270,7 @@
           <w:color w:val="666666"/>
           <w:sz w:val="20"/>
         </w:rPr>
-        <w:t>[SCREEN: Navigate to the AI Q&amp;A Assistant page, show Groq selected, type a sample question and display the response]</w:t>
+        <w:t>[SCREEN: Navigate to the AI Q&amp;A Assistant page, show OpenRouter selected, type a sample question and display the response]</w:t>
       </w:r>
     </w:p>
     <w:p>
@@ -478,7 +478,7 @@
           <w:color w:val="666666"/>
           <w:sz w:val="20"/>
         </w:rPr>
-        <w:t>[SCREEN: Navigate to the AI Q&amp;A Assistant page, select Groq as the provider, type "Why is the gap so large for Hispanic students?" and show the response]</w:t>
+        <w:t>[SCREEN: Navigate to the AI Q&amp;A Assistant page, select OpenRouter as the provider, type "Why is the gap so large for Hispanic students?" and show the response]</w:t>
       </w:r>
     </w:p>
     <w:p>
@@ -538,7 +538,7 @@
         <w:t xml:space="preserve">IDO: </w:t>
       </w:r>
       <w:r>
-        <w:t>"MatadorAudit is built on proven open-source tools: Python, Streamlit, Plotly for the dashboard, and multiple AI providers for the Q&amp;A assistant -- with Groq as the free default. The total annual cost is under 500 dollars."</w:t>
+        <w:t>"MatadorAudit is built on proven open-source tools: Python, Streamlit, Plotly for the dashboard, and multiple AI providers for the Q&amp;A assistant -- with OpenRouter as the free default. The total annual cost is under 500 dollars."</w:t>
       </w:r>
     </w:p>
     <w:p>
@@ -770,7 +770,7 @@
     </w:p>
     <w:p>
       <w:r>
-        <w:t>- The AI Q&amp;A Assistant with Groq (demonstrates free, no-setup AI)</w:t>
+        <w:t>- The AI Q&amp;A Assistant with OpenRouter (demonstrates free, no-setup AI)</w:t>
       </w:r>
     </w:p>
     <w:p>
@@ -801,7 +801,7 @@
     </w:p>
     <w:p>
       <w:r>
-        <w:t>- Innovation &amp; Responsible AI (30pts): Multi-Audit Dashboard, AI Q&amp;A with Groq, proxy detection, What-If Simulator, ethics-first design, no automated debiasing</w:t>
+        <w:t>- Innovation &amp; Responsible AI (30pts): Multi-Audit Dashboard, AI Q&amp;A with OpenRouter, proxy detection, What-If Simulator, ethics-first design, no automated debiasing</w:t>
       </w:r>
     </w:p>
     <w:p>

</xml_diff>